<commit_message>
Update Lab 2 CI evaluation documentation
Co-authored-by: Copilot <223556219+Copilot@users.noreply.github.com>
</commit_message>
<xml_diff>
--- a/Lab2/LAB2-CI-DOCUMENTATION.docx
+++ b/Lab2/LAB2-CI-DOCUMENTATION.docx
@@ -1852,18 +1852,16 @@
       </w:pPr>
       <w:r>
         <w:rPr/>
-        <w:t xml:space="preserve">Push the </w:t>
-      </w:r>
-      <w:r>
-        <w:rPr>
-          <w:rStyle w:val="SourceText"/>
-        </w:rPr>
-        <w:t>Lab2</w:t>
-      </w:r>
-      <w:r>
-        <w:rPr/>
-        <w:t xml:space="preserve"> folder to a GitHub repository. </w:t>
-      </w:r>
+        <w:t xml:space="preserve">Open the GitHub repository: </w:t>
+      </w:r>
+      <w:hyperlink r:id="rId2">
+        <w:r>
+          <w:rPr>
+            <w:rStyle w:val="Hyperlink"/>
+          </w:rPr>
+          <w:t xml:space="preserve">https://github.com/DarshanHeble/lab2exercise/tree/main/Lab2 </w:t>
+        </w:r>
+      </w:hyperlink>
     </w:p>
     <w:p>
       <w:pPr>
@@ -1883,6 +1881,35 @@
       </w:pPr>
       <w:r>
         <w:rPr/>
+        <w:t xml:space="preserve">Open the workflow file: </w:t>
+      </w:r>
+      <w:hyperlink r:id="rId3">
+        <w:r>
+          <w:rPr>
+            <w:rStyle w:val="Hyperlink"/>
+          </w:rPr>
+          <w:t xml:space="preserve">.github/workflows/lab2-ci.yml </w:t>
+        </w:r>
+      </w:hyperlink>
+    </w:p>
+    <w:p>
+      <w:pPr>
+        <w:pStyle w:val="BodyText"/>
+        <w:numPr>
+          <w:ilvl w:val="0"/>
+          <w:numId w:val="5"/>
+        </w:numPr>
+        <w:tabs>
+          <w:tab w:val="clear" w:pos="1134"/>
+          <w:tab w:val="left" w:pos="1309" w:leader="none"/>
+        </w:tabs>
+        <w:bidi w:val="0"/>
+        <w:spacing w:before="0" w:after="0"/>
+        <w:ind w:hanging="283" w:start="1309"/>
+        <w:rPr/>
+      </w:pPr>
+      <w:r>
+        <w:rPr/>
         <w:t xml:space="preserve">Open the repository on GitHub and select the </w:t>
       </w:r>
       <w:r>
@@ -1945,18 +1972,16 @@
       </w:pPr>
       <w:r>
         <w:rPr/>
-        <w:t xml:space="preserve">Make a small change inside </w:t>
-      </w:r>
-      <w:r>
-        <w:rPr>
-          <w:rStyle w:val="SourceText"/>
-        </w:rPr>
-        <w:t>Lab2/</w:t>
-      </w:r>
-      <w:r>
-        <w:rPr/>
-        <w:t xml:space="preserve">, commit it, and push it. </w:t>
-      </w:r>
+        <w:t xml:space="preserve">Open the successful workflow run: </w:t>
+      </w:r>
+      <w:hyperlink r:id="rId4">
+        <w:r>
+          <w:rPr>
+            <w:rStyle w:val="Hyperlink"/>
+          </w:rPr>
+          <w:t xml:space="preserve">GitHub Actions run 37100764609 </w:t>
+        </w:r>
+      </w:hyperlink>
     </w:p>
     <w:p>
       <w:pPr>
@@ -1976,7 +2001,17 @@
       </w:pPr>
       <w:r>
         <w:rPr/>
-        <w:t xml:space="preserve">Open the newly created workflow run. </w:t>
+        <w:t xml:space="preserve">Show the successful </w:t>
+      </w:r>
+      <w:r>
+        <w:rPr>
+          <w:b/>
+        </w:rPr>
+        <w:t>Test backend</w:t>
+      </w:r>
+      <w:r>
+        <w:rPr/>
+        <w:t xml:space="preserve"> job. </w:t>
       </w:r>
     </w:p>
     <w:p>
@@ -2003,7 +2038,7 @@
         <w:rPr>
           <w:b/>
         </w:rPr>
-        <w:t>Test backend</w:t>
+        <w:t>Lint and build frontend</w:t>
       </w:r>
       <w:r>
         <w:rPr/>
@@ -2022,37 +2057,6 @@
           <w:tab w:val="left" w:pos="1309" w:leader="none"/>
         </w:tabs>
         <w:bidi w:val="0"/>
-        <w:spacing w:before="0" w:after="0"/>
-        <w:ind w:hanging="283" w:start="1309"/>
-        <w:rPr/>
-      </w:pPr>
-      <w:r>
-        <w:rPr/>
-        <w:t xml:space="preserve">Show the successful </w:t>
-      </w:r>
-      <w:r>
-        <w:rPr>
-          <w:b/>
-        </w:rPr>
-        <w:t>Lint and build frontend</w:t>
-      </w:r>
-      <w:r>
-        <w:rPr/>
-        <w:t xml:space="preserve"> job. </w:t>
-      </w:r>
-    </w:p>
-    <w:p>
-      <w:pPr>
-        <w:pStyle w:val="BodyText"/>
-        <w:numPr>
-          <w:ilvl w:val="0"/>
-          <w:numId w:val="5"/>
-        </w:numPr>
-        <w:tabs>
-          <w:tab w:val="clear" w:pos="1134"/>
-          <w:tab w:val="left" w:pos="1309" w:leader="none"/>
-        </w:tabs>
-        <w:bidi w:val="0"/>
         <w:ind w:hanging="283" w:start="1309"/>
         <w:rPr/>
       </w:pPr>
@@ -2099,7 +2103,28 @@
       </w:pPr>
       <w:r>
         <w:rPr/>
-        <w:t>The green check marks prove that the commit passed the CI checks.</w:t>
+        <w:t xml:space="preserve">The green check marks prove that commit </w:t>
+      </w:r>
+      <w:r>
+        <w:rPr>
+          <w:rStyle w:val="SourceText"/>
+        </w:rPr>
+        <w:t>96a6db7</w:t>
+      </w:r>
+      <w:r>
+        <w:rPr/>
+        <w:t xml:space="preserve"> passed the CI checks.</w:t>
+      </w:r>
+    </w:p>
+    <w:p>
+      <w:pPr>
+        <w:pStyle w:val="BodyText"/>
+        <w:bidi w:val="0"/>
+        <w:rPr/>
+      </w:pPr>
+      <w:r>
+        <w:rPr/>
+        <w:t>For evaluation, capture three screenshots: the successful workflow overview, the passed backend test, and the passed frontend lint and build steps.</w:t>
       </w:r>
     </w:p>
     <w:p>

</xml_diff>

<commit_message>
Add screenshot placeholders to Lab 2 documentation
Co-authored-by: Copilot <223556219+Copilot@users.noreply.github.com>
</commit_message>
<xml_diff>
--- a/Lab2/LAB2-CI-DOCUMENTATION.docx
+++ b/Lab2/LAB2-CI-DOCUMENTATION.docx
@@ -2125,6 +2125,131 @@
       <w:r>
         <w:rPr/>
         <w:t>For evaluation, capture three screenshots: the successful workflow overview, the passed backend test, and the passed frontend lint and build steps.</w:t>
+      </w:r>
+    </w:p>
+    <w:p>
+      <w:pPr>
+        <w:pStyle w:val="Heading3"/>
+        <w:bidi w:val="0"/>
+        <w:rPr/>
+      </w:pPr>
+      <w:r>
+        <w:rPr/>
+        <w:t>Screenshot Evidence</w:t>
+      </w:r>
+    </w:p>
+    <w:p>
+      <w:pPr>
+        <w:pStyle w:val="BodyText"/>
+        <w:bidi w:val="0"/>
+        <w:rPr/>
+      </w:pPr>
+      <w:r>
+        <w:rPr/>
+        <w:t xml:space="preserve">Paste the screenshots in the spaces below. In Microsoft Word, click inside a box and use </w:t>
+      </w:r>
+      <w:r>
+        <w:rPr>
+          <w:b/>
+        </w:rPr>
+        <w:t>Insert → Pictures</w:t>
+      </w:r>
+      <w:r>
+        <w:rPr/>
+        <w:t>.</w:t>
+      </w:r>
+    </w:p>
+    <w:p>
+      <w:pPr>
+        <w:pStyle w:val="BodyText"/>
+        <w:bidi w:val="0"/>
+        <w:spacing w:before="180" w:after="90"/>
+        <w:ind w:hanging="0" w:start="180" w:end="180"/>
+        <w:jc w:val="center"/>
+        <w:rPr>
+          <w:color w:val="7F8C8D"/>
+          <w:bdr w:val="single" w:sz="2" w:space="14" w:color="7F8C8D"/>
+        </w:rPr>
+      </w:pPr>
+      <w:r>
+        <w:rPr>
+          <w:color w:val="7F8C8D"/>
+          <w:bdr w:val="single" w:sz="2" w:space="14" w:color="7F8C8D"/>
+        </w:rPr>
+        <w:t>PASTE SCREENSHOT 1 HERE</w:t>
+      </w:r>
+    </w:p>
+    <w:p>
+      <w:pPr>
+        <w:pStyle w:val="BodyTextcaption"/>
+        <w:bidi w:val="0"/>
+        <w:rPr/>
+      </w:pPr>
+      <w:r>
+        <w:rPr/>
+        <w:t>Figure 1: Successful Lab 2 CI workflow overview</w:t>
+      </w:r>
+    </w:p>
+    <w:p>
+      <w:pPr>
+        <w:pStyle w:val="BodyText"/>
+        <w:bidi w:val="0"/>
+        <w:spacing w:before="180" w:after="90"/>
+        <w:ind w:hanging="0" w:start="180" w:end="180"/>
+        <w:jc w:val="center"/>
+        <w:rPr>
+          <w:color w:val="7F8C8D"/>
+          <w:bdr w:val="single" w:sz="2" w:space="14" w:color="7F8C8D"/>
+        </w:rPr>
+      </w:pPr>
+      <w:r>
+        <w:rPr>
+          <w:color w:val="7F8C8D"/>
+          <w:bdr w:val="single" w:sz="2" w:space="14" w:color="7F8C8D"/>
+        </w:rPr>
+        <w:t>PASTE SCREENSHOT 2 HERE</w:t>
+      </w:r>
+    </w:p>
+    <w:p>
+      <w:pPr>
+        <w:pStyle w:val="BodyTextcaption"/>
+        <w:bidi w:val="0"/>
+        <w:rPr/>
+      </w:pPr>
+      <w:r>
+        <w:rPr/>
+        <w:t>Figure 2: Backend tests passed successfully</w:t>
+      </w:r>
+    </w:p>
+    <w:p>
+      <w:pPr>
+        <w:pStyle w:val="BodyText"/>
+        <w:bidi w:val="0"/>
+        <w:spacing w:before="180" w:after="90"/>
+        <w:ind w:hanging="0" w:start="180" w:end="180"/>
+        <w:jc w:val="center"/>
+        <w:rPr>
+          <w:color w:val="7F8C8D"/>
+          <w:bdr w:val="single" w:sz="2" w:space="14" w:color="7F8C8D"/>
+        </w:rPr>
+      </w:pPr>
+      <w:r>
+        <w:rPr>
+          <w:color w:val="7F8C8D"/>
+          <w:bdr w:val="single" w:sz="2" w:space="14" w:color="7F8C8D"/>
+        </w:rPr>
+        <w:t>PASTE SCREENSHOT 3 HERE</w:t>
+      </w:r>
+    </w:p>
+    <w:p>
+      <w:pPr>
+        <w:pStyle w:val="BodyTextcaption"/>
+        <w:bidi w:val="0"/>
+        <w:rPr/>
+      </w:pPr>
+      <w:r>
+        <w:rPr/>
+        <w:t>Figure 3: Frontend linting and production build passed</w:t>
       </w:r>
     </w:p>
     <w:p>
@@ -3493,6 +3618,19 @@
     </w:pPr>
     <w:rPr/>
   </w:style>
+  <w:style w:type="paragraph" w:styleId="BodyTextcaption">
+    <w:name w:val="Body Text.caption"/>
+    <w:basedOn w:val="BodyText"/>
+    <w:qFormat/>
+    <w:pPr>
+      <w:spacing w:before="0" w:after="300"/>
+      <w:jc w:val="center"/>
+    </w:pPr>
+    <w:rPr>
+      <w:i/>
+      <w:iCs/>
+    </w:rPr>
+  </w:style>
 </w:styles>
 </file>
 

</xml_diff>